<commit_message>
perf: prevent indexing of chatbot placeholder texts during SSR to optimize crawler sequence
</commit_message>
<xml_diff>
--- a/Madhu Dadi_Resume_Optimized.docx
+++ b/Madhu Dadi_Resume_Optimized.docx
@@ -4,7 +4,7 @@
   <w:body>
     <w:p>
       <w:pPr>
-        <w:spacing w:before="0" w:after="0" w:line="240" w:lineRule="auto"/>
+        <w:spacing w:before="0" w:after="0" w:line="262" w:lineRule="auto"/>
         <w:jc w:val="center"/>
       </w:pPr>
       <w:r>
@@ -13,14 +13,14 @@
           <w:b/>
           <w:i w:val="0"/>
           <w:color w:val="0B2545"/>
-          <w:sz w:val="34"/>
+          <w:sz w:val="50"/>
         </w:rPr>
         <w:t>Madhu Dadi</w:t>
       </w:r>
     </w:p>
     <w:p>
       <w:pPr>
-        <w:spacing w:before="0" w:after="30" w:line="240" w:lineRule="auto"/>
+        <w:spacing w:before="0" w:after="30" w:line="262" w:lineRule="auto"/>
         <w:jc w:val="center"/>
       </w:pPr>
       <w:r>
@@ -29,14 +29,14 @@
           <w:b/>
           <w:i w:val="0"/>
           <w:color w:val="1F4D78"/>
-          <w:sz w:val="17"/>
+          <w:sz w:val="22"/>
         </w:rPr>
         <w:t>AI &amp; Analytics Leader | LLM/RAG Applications | Healthcare, Marketing &amp; Decision Intelligence</w:t>
       </w:r>
     </w:p>
     <w:p>
       <w:pPr>
-        <w:spacing w:before="0" w:after="44" w:line="240" w:lineRule="auto"/>
+        <w:spacing w:before="0" w:after="44" w:line="262" w:lineRule="auto"/>
         <w:jc w:val="center"/>
       </w:pPr>
       <w:r>
@@ -45,14 +45,14 @@
           <w:b w:val="0"/>
           <w:i w:val="0"/>
           <w:color w:val="374151"/>
-          <w:sz w:val="14"/>
+          <w:sz w:val="18"/>
         </w:rPr>
         <w:t>Hyderabad, India | +91 9985422444 | madhu.kumar245@gmail.com | linkedin.com/in/madhu-dadi-54684531 | madhudadi.in | github.com/madhu2456</w:t>
       </w:r>
     </w:p>
     <w:p>
       <w:pPr>
-        <w:spacing w:before="100" w:after="40" w:line="240" w:lineRule="auto"/>
+        <w:spacing w:before="200" w:after="90" w:line="259" w:lineRule="auto"/>
         <w:pBdr>
           <w:bottom w:val="single" w:sz="5" w:space="1" w:color="9FB6CF"/>
         </w:pBdr>
@@ -63,7 +63,7 @@
           <w:b/>
           <w:i w:val="0"/>
           <w:color w:val="1F4D78"/>
-          <w:sz w:val="17"/>
+          <w:sz w:val="22"/>
         </w:rPr>
         <w:t>SUMMARY</w:t>
       </w:r>
@@ -71,8 +71,8 @@
     <w:p>
       <w:pPr>
         <w:pStyle w:val="ListBullet"/>
-        <w:spacing w:before="0" w:after="23" w:line="240" w:lineRule="auto"/>
-        <w:ind w:left="259" w:hanging="173"/>
+        <w:spacing w:before="0" w:after="88" w:line="283" w:lineRule="auto"/>
+        <w:ind w:left="317" w:hanging="202"/>
       </w:pPr>
       <w:r>
         <w:rPr>
@@ -80,7 +80,7 @@
           <w:b w:val="0"/>
           <w:i w:val="0"/>
           <w:color w:val="111827"/>
-          <w:sz w:val="15"/>
+          <w:sz w:val="20"/>
         </w:rPr>
         <w:t>Senior Analytics Manager with 9+ years of experience driving AI, analytics, and digital transformation across healthcare, travel-tech, media, search marketing, and web/product development.</w:t>
       </w:r>
@@ -88,8 +88,8 @@
     <w:p>
       <w:pPr>
         <w:pStyle w:val="ListBullet"/>
-        <w:spacing w:before="0" w:after="23" w:line="240" w:lineRule="auto"/>
-        <w:ind w:left="259" w:hanging="173"/>
+        <w:spacing w:before="0" w:after="88" w:line="283" w:lineRule="auto"/>
+        <w:ind w:left="317" w:hanging="202"/>
       </w:pPr>
       <w:r>
         <w:rPr>
@@ -97,7 +97,7 @@
           <w:b w:val="0"/>
           <w:i w:val="0"/>
           <w:color w:val="111827"/>
-          <w:sz w:val="15"/>
+          <w:sz w:val="20"/>
         </w:rPr>
         <w:t>Builds LLM/RAG applications, agentic workflows, KPI frameworks, Marketing Mix Models, dashboards, and full-stack analytics products that connect business decisions to measurable outcomes.</w:t>
       </w:r>
@@ -105,8 +105,8 @@
     <w:p>
       <w:pPr>
         <w:pStyle w:val="ListBullet"/>
-        <w:spacing w:before="0" w:after="23" w:line="240" w:lineRule="auto"/>
-        <w:ind w:left="259" w:hanging="173"/>
+        <w:spacing w:before="0" w:after="88" w:line="283" w:lineRule="auto"/>
+        <w:ind w:left="317" w:hanging="202"/>
       </w:pPr>
       <w:r>
         <w:rPr>
@@ -114,14 +114,14 @@
           <w:b w:val="0"/>
           <w:i w:val="0"/>
           <w:color w:val="111827"/>
-          <w:sz w:val="15"/>
+          <w:sz w:val="20"/>
         </w:rPr>
         <w:t>Proven impact across patient enrollment, digital onboarding, campaign acquisition, churn reduction, global client analytics, and production AI/search visibility products.</w:t>
       </w:r>
     </w:p>
     <w:p>
       <w:pPr>
-        <w:spacing w:before="100" w:after="40" w:line="240" w:lineRule="auto"/>
+        <w:spacing w:before="200" w:after="90" w:line="259" w:lineRule="auto"/>
         <w:pBdr>
           <w:bottom w:val="single" w:sz="5" w:space="1" w:color="9FB6CF"/>
         </w:pBdr>
@@ -132,14 +132,14 @@
           <w:b/>
           <w:i w:val="0"/>
           <w:color w:val="1F4D78"/>
-          <w:sz w:val="17"/>
+          <w:sz w:val="22"/>
         </w:rPr>
         <w:t>EXPERIENCE</w:t>
       </w:r>
     </w:p>
     <w:p>
       <w:pPr>
-        <w:spacing w:before="50" w:after="16" w:line="240" w:lineRule="auto"/>
+        <w:spacing w:before="80" w:after="44" w:line="259" w:lineRule="auto"/>
       </w:pPr>
       <w:r>
         <w:rPr>
@@ -147,7 +147,7 @@
           <w:b/>
           <w:i w:val="0"/>
           <w:color w:val="0B2545"/>
-          <w:sz w:val="16"/>
+          <w:sz w:val="21"/>
         </w:rPr>
         <w:t>Senior Analytics Manager</w:t>
       </w:r>
@@ -157,7 +157,7 @@
           <w:b/>
           <w:i w:val="0"/>
           <w:color w:val="111827"/>
-          <w:sz w:val="16"/>
+          <w:sz w:val="21"/>
         </w:rPr>
         <w:t xml:space="preserve"> | Novartis</w:t>
       </w:r>
@@ -167,7 +167,7 @@
           <w:b w:val="0"/>
           <w:i w:val="0"/>
           <w:color w:val="4B5563"/>
-          <w:sz w:val="16"/>
+          <w:sz w:val="21"/>
         </w:rPr>
         <w:t xml:space="preserve"> | March 2023 - Present</w:t>
       </w:r>
@@ -177,7 +177,7 @@
           <w:b w:val="0"/>
           <w:i w:val="0"/>
           <w:color w:val="4B5563"/>
-          <w:sz w:val="16"/>
+          <w:sz w:val="21"/>
         </w:rPr>
         <w:t xml:space="preserve"> | India</w:t>
       </w:r>
@@ -185,8 +185,8 @@
     <w:p>
       <w:pPr>
         <w:pStyle w:val="ListBullet"/>
-        <w:spacing w:before="0" w:after="23" w:line="240" w:lineRule="auto"/>
-        <w:ind w:left="259" w:hanging="173"/>
+        <w:spacing w:before="0" w:after="88" w:line="283" w:lineRule="auto"/>
+        <w:ind w:left="317" w:hanging="202"/>
       </w:pPr>
       <w:r>
         <w:rPr>
@@ -194,7 +194,7 @@
           <w:b w:val="0"/>
           <w:i w:val="0"/>
           <w:color w:val="111827"/>
-          <w:sz w:val="15"/>
+          <w:sz w:val="20"/>
         </w:rPr>
         <w:t>Implemented data-driven frameworks across multi-channel digital platforms, driving a 15% increase in patient enrollment.</w:t>
       </w:r>
@@ -202,8 +202,8 @@
     <w:p>
       <w:pPr>
         <w:pStyle w:val="ListBullet"/>
-        <w:spacing w:before="0" w:after="23" w:line="240" w:lineRule="auto"/>
-        <w:ind w:left="259" w:hanging="173"/>
+        <w:spacing w:before="0" w:after="88" w:line="283" w:lineRule="auto"/>
+        <w:ind w:left="317" w:hanging="202"/>
       </w:pPr>
       <w:r>
         <w:rPr>
@@ -211,7 +211,7 @@
           <w:b w:val="0"/>
           <w:i w:val="0"/>
           <w:color w:val="111827"/>
-          <w:sz w:val="15"/>
+          <w:sz w:val="20"/>
         </w:rPr>
         <w:t>Architected KPI measurement frameworks that transitioned 90% of patients to digital enrollments and reduced Turnaround Time (TAT) from several days to under 3 hours.</w:t>
       </w:r>
@@ -219,8 +219,8 @@
     <w:p>
       <w:pPr>
         <w:pStyle w:val="ListBullet"/>
-        <w:spacing w:before="0" w:after="23" w:line="240" w:lineRule="auto"/>
-        <w:ind w:left="259" w:hanging="173"/>
+        <w:spacing w:before="0" w:after="88" w:line="283" w:lineRule="auto"/>
+        <w:ind w:left="317" w:hanging="202"/>
       </w:pPr>
       <w:r>
         <w:rPr>
@@ -228,7 +228,7 @@
           <w:b w:val="0"/>
           <w:i w:val="0"/>
           <w:color w:val="111827"/>
-          <w:sz w:val="15"/>
+          <w:sz w:val="20"/>
         </w:rPr>
         <w:t>Engineered enterprise-wide patient flows that accelerated digital asset launches from 3 months to 2 weeks.</w:t>
       </w:r>
@@ -236,8 +236,8 @@
     <w:p>
       <w:pPr>
         <w:pStyle w:val="ListBullet"/>
-        <w:spacing w:before="0" w:after="23" w:line="240" w:lineRule="auto"/>
-        <w:ind w:left="259" w:hanging="173"/>
+        <w:spacing w:before="0" w:after="88" w:line="283" w:lineRule="auto"/>
+        <w:ind w:left="317" w:hanging="202"/>
       </w:pPr>
       <w:r>
         <w:rPr>
@@ -245,7 +245,7 @@
           <w:b w:val="0"/>
           <w:i w:val="0"/>
           <w:color w:val="111827"/>
-          <w:sz w:val="15"/>
+          <w:sz w:val="20"/>
         </w:rPr>
         <w:t>Won 2 internal AI Hackathons by developing Model Context Protocols (MCPs) and advanced Marketing Mix Models (MMM) for marketing spend optimization.</w:t>
       </w:r>
@@ -253,8 +253,8 @@
     <w:p>
       <w:pPr>
         <w:pStyle w:val="ListBullet"/>
-        <w:spacing w:before="0" w:after="23" w:line="240" w:lineRule="auto"/>
-        <w:ind w:left="259" w:hanging="173"/>
+        <w:spacing w:before="0" w:after="88" w:line="283" w:lineRule="auto"/>
+        <w:ind w:left="317" w:hanging="202"/>
       </w:pPr>
       <w:r>
         <w:rPr>
@@ -262,7 +262,7 @@
           <w:b w:val="0"/>
           <w:i w:val="0"/>
           <w:color w:val="111827"/>
-          <w:sz w:val="15"/>
+          <w:sz w:val="20"/>
         </w:rPr>
         <w:t>Directed end-to-end analytics lifecycles, maintaining a 4.9/5 patient satisfaction score through optimized enrollment and adherence communication programs.</w:t>
       </w:r>
@@ -270,8 +270,8 @@
     <w:p>
       <w:pPr>
         <w:pStyle w:val="ListBullet"/>
-        <w:spacing w:before="0" w:after="23" w:line="240" w:lineRule="auto"/>
-        <w:ind w:left="259" w:hanging="173"/>
+        <w:spacing w:before="0" w:after="88" w:line="283" w:lineRule="auto"/>
+        <w:ind w:left="317" w:hanging="202"/>
       </w:pPr>
       <w:r>
         <w:rPr>
@@ -279,14 +279,14 @@
           <w:b w:val="0"/>
           <w:i w:val="0"/>
           <w:color w:val="111827"/>
-          <w:sz w:val="15"/>
+          <w:sz w:val="20"/>
         </w:rPr>
         <w:t>Delivered strategic analytical insights to senior leadership and integrated AI-driven marketing strategies, improving operational efficiency by 25%.</w:t>
       </w:r>
     </w:p>
     <w:p>
       <w:pPr>
-        <w:spacing w:before="50" w:after="16" w:line="240" w:lineRule="auto"/>
+        <w:spacing w:before="80" w:after="44" w:line="259" w:lineRule="auto"/>
       </w:pPr>
       <w:r>
         <w:rPr>
@@ -294,7 +294,7 @@
           <w:b/>
           <w:i w:val="0"/>
           <w:color w:val="0B2545"/>
-          <w:sz w:val="16"/>
+          <w:sz w:val="21"/>
         </w:rPr>
         <w:t>Marketing Analytics Manager</w:t>
       </w:r>
@@ -304,7 +304,7 @@
           <w:b/>
           <w:i w:val="0"/>
           <w:color w:val="111827"/>
-          <w:sz w:val="16"/>
+          <w:sz w:val="21"/>
         </w:rPr>
         <w:t xml:space="preserve"> | redBus (MMT Group)</w:t>
       </w:r>
@@ -314,7 +314,7 @@
           <w:b w:val="0"/>
           <w:i w:val="0"/>
           <w:color w:val="4B5563"/>
-          <w:sz w:val="16"/>
+          <w:sz w:val="21"/>
         </w:rPr>
         <w:t xml:space="preserve"> | June 2022 - March 2023</w:t>
       </w:r>
@@ -324,7 +324,7 @@
           <w:b w:val="0"/>
           <w:i w:val="0"/>
           <w:color w:val="4B5563"/>
-          <w:sz w:val="16"/>
+          <w:sz w:val="21"/>
         </w:rPr>
         <w:t xml:space="preserve"> | India</w:t>
       </w:r>
@@ -332,8 +332,8 @@
     <w:p>
       <w:pPr>
         <w:pStyle w:val="ListBullet"/>
-        <w:spacing w:before="0" w:after="23" w:line="240" w:lineRule="auto"/>
-        <w:ind w:left="259" w:hanging="173"/>
+        <w:spacing w:before="0" w:after="88" w:line="283" w:lineRule="auto"/>
+        <w:ind w:left="317" w:hanging="202"/>
       </w:pPr>
       <w:r>
         <w:rPr>
@@ -341,7 +341,7 @@
           <w:b w:val="0"/>
           <w:i w:val="0"/>
           <w:color w:val="111827"/>
-          <w:sz w:val="15"/>
+          <w:sz w:val="20"/>
         </w:rPr>
         <w:t>Received Best Performer of the Quarter (Q3 Trailblazer) for a campaign strategy that drove 30% growth in new customer acquisition.</w:t>
       </w:r>
@@ -349,8 +349,8 @@
     <w:p>
       <w:pPr>
         <w:pStyle w:val="ListBullet"/>
-        <w:spacing w:before="0" w:after="23" w:line="240" w:lineRule="auto"/>
-        <w:ind w:left="259" w:hanging="173"/>
+        <w:spacing w:before="0" w:after="88" w:line="283" w:lineRule="auto"/>
+        <w:ind w:left="317" w:hanging="202"/>
       </w:pPr>
       <w:r>
         <w:rPr>
@@ -358,7 +358,7 @@
           <w:b w:val="0"/>
           <w:i w:val="0"/>
           <w:color w:val="111827"/>
-          <w:sz w:val="15"/>
+          <w:sz w:val="20"/>
         </w:rPr>
         <w:t>Optimized multi-channel brand campaigns across Facebook, Programmatic, and Google Ads to improve performance and budget efficiency.</w:t>
       </w:r>
@@ -366,8 +366,8 @@
     <w:p>
       <w:pPr>
         <w:pStyle w:val="ListBullet"/>
-        <w:spacing w:before="0" w:after="23" w:line="240" w:lineRule="auto"/>
-        <w:ind w:left="259" w:hanging="173"/>
+        <w:spacing w:before="0" w:after="88" w:line="283" w:lineRule="auto"/>
+        <w:ind w:left="317" w:hanging="202"/>
       </w:pPr>
       <w:r>
         <w:rPr>
@@ -375,7 +375,7 @@
           <w:b w:val="0"/>
           <w:i w:val="0"/>
           <w:color w:val="111827"/>
-          <w:sz w:val="15"/>
+          <w:sz w:val="20"/>
         </w:rPr>
         <w:t>Strategized and executed CLM campaigns across Email, WhatsApp, and SMS, reducing customer churn by 20%.</w:t>
       </w:r>
@@ -383,8 +383,8 @@
     <w:p>
       <w:pPr>
         <w:pStyle w:val="ListBullet"/>
-        <w:spacing w:before="0" w:after="23" w:line="240" w:lineRule="auto"/>
-        <w:ind w:left="259" w:hanging="173"/>
+        <w:spacing w:before="0" w:after="88" w:line="283" w:lineRule="auto"/>
+        <w:ind w:left="317" w:hanging="202"/>
       </w:pPr>
       <w:r>
         <w:rPr>
@@ -392,14 +392,14 @@
           <w:b w:val="0"/>
           <w:i w:val="0"/>
           <w:color w:val="111827"/>
-          <w:sz w:val="15"/>
+          <w:sz w:val="20"/>
         </w:rPr>
         <w:t>Led marketing analytics measurement for ATL, BTL, and digital campaigns, including impact reporting across redBus markets.</w:t>
       </w:r>
     </w:p>
     <w:p>
       <w:pPr>
-        <w:spacing w:before="50" w:after="16" w:line="240" w:lineRule="auto"/>
+        <w:spacing w:before="80" w:after="44" w:line="259" w:lineRule="auto"/>
       </w:pPr>
       <w:r>
         <w:rPr>
@@ -407,7 +407,7 @@
           <w:b/>
           <w:i w:val="0"/>
           <w:color w:val="0B2545"/>
-          <w:sz w:val="16"/>
+          <w:sz w:val="21"/>
         </w:rPr>
         <w:t>Analytics Manager</w:t>
       </w:r>
@@ -417,7 +417,7 @@
           <w:b/>
           <w:i w:val="0"/>
           <w:color w:val="111827"/>
-          <w:sz w:val="16"/>
+          <w:sz w:val="21"/>
         </w:rPr>
         <w:t xml:space="preserve"> | GroupM</w:t>
       </w:r>
@@ -427,7 +427,7 @@
           <w:b w:val="0"/>
           <w:i w:val="0"/>
           <w:color w:val="4B5563"/>
-          <w:sz w:val="16"/>
+          <w:sz w:val="21"/>
         </w:rPr>
         <w:t xml:space="preserve"> | September 2020 - May 2022</w:t>
       </w:r>
@@ -437,7 +437,7 @@
           <w:b w:val="0"/>
           <w:i w:val="0"/>
           <w:color w:val="4B5563"/>
-          <w:sz w:val="16"/>
+          <w:sz w:val="21"/>
         </w:rPr>
         <w:t xml:space="preserve"> | India</w:t>
       </w:r>
@@ -445,8 +445,8 @@
     <w:p>
       <w:pPr>
         <w:pStyle w:val="ListBullet"/>
-        <w:spacing w:before="0" w:after="23" w:line="240" w:lineRule="auto"/>
-        <w:ind w:left="259" w:hanging="173"/>
+        <w:spacing w:before="0" w:after="88" w:line="283" w:lineRule="auto"/>
+        <w:ind w:left="317" w:hanging="202"/>
       </w:pPr>
       <w:r>
         <w:rPr>
@@ -454,7 +454,7 @@
           <w:b w:val="0"/>
           <w:i w:val="0"/>
           <w:color w:val="111827"/>
-          <w:sz w:val="15"/>
+          <w:sz w:val="20"/>
         </w:rPr>
         <w:t>Spearheaded Google Ads Data Hub projects across GroupM agencies, serving the top 5% of global clients.</w:t>
       </w:r>
@@ -462,8 +462,8 @@
     <w:p>
       <w:pPr>
         <w:pStyle w:val="ListBullet"/>
-        <w:spacing w:before="0" w:after="23" w:line="240" w:lineRule="auto"/>
-        <w:ind w:left="259" w:hanging="173"/>
+        <w:spacing w:before="0" w:after="88" w:line="283" w:lineRule="auto"/>
+        <w:ind w:left="317" w:hanging="202"/>
       </w:pPr>
       <w:r>
         <w:rPr>
@@ -471,7 +471,7 @@
           <w:b w:val="0"/>
           <w:i w:val="0"/>
           <w:color w:val="111827"/>
-          <w:sz w:val="15"/>
+          <w:sz w:val="20"/>
         </w:rPr>
         <w:t>Received Best Performer of the Year (2020-2021) and earned selection for the WPP NextGen program.</w:t>
       </w:r>
@@ -479,8 +479,8 @@
     <w:p>
       <w:pPr>
         <w:pStyle w:val="ListBullet"/>
-        <w:spacing w:before="0" w:after="23" w:line="240" w:lineRule="auto"/>
-        <w:ind w:left="259" w:hanging="173"/>
+        <w:spacing w:before="0" w:after="88" w:line="283" w:lineRule="auto"/>
+        <w:ind w:left="317" w:hanging="202"/>
       </w:pPr>
       <w:r>
         <w:rPr>
@@ -488,7 +488,7 @@
           <w:b w:val="0"/>
           <w:i w:val="0"/>
           <w:color w:val="111827"/>
-          <w:sz w:val="15"/>
+          <w:sz w:val="20"/>
         </w:rPr>
         <w:t>Performed frequency reach analysis to determine optimal ad exposure, improving budget efficiency and campaign margins.</w:t>
       </w:r>
@@ -496,8 +496,8 @@
     <w:p>
       <w:pPr>
         <w:pStyle w:val="ListBullet"/>
-        <w:spacing w:before="0" w:after="23" w:line="240" w:lineRule="auto"/>
-        <w:ind w:left="259" w:hanging="173"/>
+        <w:spacing w:before="0" w:after="88" w:line="283" w:lineRule="auto"/>
+        <w:ind w:left="317" w:hanging="202"/>
       </w:pPr>
       <w:r>
         <w:rPr>
@@ -505,14 +505,14 @@
           <w:b w:val="0"/>
           <w:i w:val="0"/>
           <w:color w:val="111827"/>
-          <w:sz w:val="15"/>
+          <w:sz w:val="20"/>
         </w:rPr>
         <w:t>Managed brand lift studies, consumer journey mapping, cluster analysis, and pricing analytics for enterprise client measurement.</w:t>
       </w:r>
     </w:p>
     <w:p>
       <w:pPr>
-        <w:spacing w:before="50" w:after="16" w:line="240" w:lineRule="auto"/>
+        <w:spacing w:before="80" w:after="44" w:line="259" w:lineRule="auto"/>
       </w:pPr>
       <w:r>
         <w:rPr>
@@ -520,7 +520,7 @@
           <w:b/>
           <w:i w:val="0"/>
           <w:color w:val="0B2545"/>
-          <w:sz w:val="16"/>
+          <w:sz w:val="21"/>
         </w:rPr>
         <w:t>Web Developer and Penetration Tester</w:t>
       </w:r>
@@ -530,7 +530,7 @@
           <w:b/>
           <w:i w:val="0"/>
           <w:color w:val="111827"/>
-          <w:sz w:val="16"/>
+          <w:sz w:val="21"/>
         </w:rPr>
         <w:t xml:space="preserve"> | Absolinsoft</w:t>
       </w:r>
@@ -540,7 +540,7 @@
           <w:b w:val="0"/>
           <w:i w:val="0"/>
           <w:color w:val="4B5563"/>
-          <w:sz w:val="16"/>
+          <w:sz w:val="21"/>
         </w:rPr>
         <w:t xml:space="preserve"> | May 2016 - July 2018</w:t>
       </w:r>
@@ -550,7 +550,7 @@
           <w:b w:val="0"/>
           <w:i w:val="0"/>
           <w:color w:val="4B5563"/>
-          <w:sz w:val="16"/>
+          <w:sz w:val="21"/>
         </w:rPr>
         <w:t xml:space="preserve"> | India</w:t>
       </w:r>
@@ -558,8 +558,8 @@
     <w:p>
       <w:pPr>
         <w:pStyle w:val="ListBullet"/>
-        <w:spacing w:before="0" w:after="23" w:line="240" w:lineRule="auto"/>
-        <w:ind w:left="259" w:hanging="173"/>
+        <w:spacing w:before="0" w:after="88" w:line="283" w:lineRule="auto"/>
+        <w:ind w:left="317" w:hanging="202"/>
       </w:pPr>
       <w:r>
         <w:rPr>
@@ -567,7 +567,7 @@
           <w:b w:val="0"/>
           <w:i w:val="0"/>
           <w:color w:val="111827"/>
-          <w:sz w:val="15"/>
+          <w:sz w:val="20"/>
         </w:rPr>
         <w:t>Analyzed websites using Google Analytics and executed SEO, SMM, and SEM campaigns, reducing bounce rate by 25%.</w:t>
       </w:r>
@@ -575,8 +575,8 @@
     <w:p>
       <w:pPr>
         <w:pStyle w:val="ListBullet"/>
-        <w:spacing w:before="0" w:after="23" w:line="240" w:lineRule="auto"/>
-        <w:ind w:left="259" w:hanging="173"/>
+        <w:spacing w:before="0" w:after="88" w:line="283" w:lineRule="auto"/>
+        <w:ind w:left="317" w:hanging="202"/>
       </w:pPr>
       <w:r>
         <w:rPr>
@@ -584,7 +584,7 @@
           <w:b w:val="0"/>
           <w:i w:val="0"/>
           <w:color w:val="111827"/>
-          <w:sz w:val="15"/>
+          <w:sz w:val="20"/>
         </w:rPr>
         <w:t>Implemented and optimized organic and paid search engine marketing activities, increasing CTR by 20%.</w:t>
       </w:r>
@@ -592,8 +592,8 @@
     <w:p>
       <w:pPr>
         <w:pStyle w:val="ListBullet"/>
-        <w:spacing w:before="0" w:after="23" w:line="240" w:lineRule="auto"/>
-        <w:ind w:left="259" w:hanging="173"/>
+        <w:spacing w:before="0" w:after="88" w:line="283" w:lineRule="auto"/>
+        <w:ind w:left="317" w:hanging="202"/>
       </w:pPr>
       <w:r>
         <w:rPr>
@@ -601,16 +601,17 @@
           <w:b w:val="0"/>
           <w:i w:val="0"/>
           <w:color w:val="111827"/>
-          <w:sz w:val="15"/>
+          <w:sz w:val="20"/>
         </w:rPr>
         <w:t>Strategized social media campaigns and documented project/product plans for web applications.</w:t>
       </w:r>
     </w:p>
     <w:p>
       <w:pPr>
+        <w:spacing w:line="262" w:lineRule="auto"/>
         <w:sectPr>
           <w:pgSz w:w="12240" w:h="15840"/>
-          <w:pgMar w:top="547" w:right="691" w:bottom="547" w:left="691" w:header="360" w:footer="360" w:gutter="0"/>
+          <w:pgMar w:top="605" w:right="691" w:bottom="605" w:left="691" w:header="360" w:footer="360" w:gutter="0"/>
           <w:cols w:space="720"/>
           <w:docGrid w:linePitch="360"/>
         </w:sectPr>
@@ -618,7 +619,7 @@
     </w:p>
     <w:p>
       <w:pPr>
-        <w:spacing w:before="100" w:after="40" w:line="240" w:lineRule="auto"/>
+        <w:spacing w:before="160" w:after="70" w:line="259" w:lineRule="auto"/>
         <w:pBdr>
           <w:bottom w:val="single" w:sz="5" w:space="1" w:color="9FB6CF"/>
         </w:pBdr>
@@ -629,14 +630,14 @@
           <w:b/>
           <w:i w:val="0"/>
           <w:color w:val="1F4D78"/>
-          <w:sz w:val="17"/>
+          <w:sz w:val="21"/>
         </w:rPr>
         <w:t>SELECTED PROJECTS</w:t>
       </w:r>
     </w:p>
     <w:p>
       <w:pPr>
-        <w:spacing w:before="48" w:after="16" w:line="240" w:lineRule="auto"/>
+        <w:spacing w:before="60" w:after="36" w:line="259" w:lineRule="auto"/>
       </w:pPr>
       <w:r>
         <w:rPr>
@@ -644,7 +645,7 @@
           <w:b/>
           <w:i w:val="0"/>
           <w:color w:val="0B2545"/>
-          <w:sz w:val="16"/>
+          <w:sz w:val="20"/>
         </w:rPr>
         <w:t>Adticks</w:t>
       </w:r>
@@ -654,7 +655,7 @@
           <w:b/>
           <w:i w:val="0"/>
           <w:color w:val="111827"/>
-          <w:sz w:val="16"/>
+          <w:sz w:val="20"/>
         </w:rPr>
         <w:t xml:space="preserve"> | Full-stack / AI Engineer</w:t>
       </w:r>
@@ -664,7 +665,7 @@
           <w:b w:val="0"/>
           <w:i w:val="0"/>
           <w:color w:val="4B5563"/>
-          <w:sz w:val="15"/>
+          <w:sz w:val="20"/>
         </w:rPr>
         <w:t xml:space="preserve"> | 2026 - Present</w:t>
       </w:r>
@@ -674,7 +675,7 @@
           <w:b w:val="0"/>
           <w:i w:val="0"/>
           <w:color w:val="2563EB"/>
-          <w:sz w:val="15"/>
+          <w:sz w:val="20"/>
         </w:rPr>
         <w:t xml:space="preserve"> | adticks.com</w:t>
       </w:r>
@@ -682,8 +683,8 @@
     <w:p>
       <w:pPr>
         <w:pStyle w:val="ListBullet"/>
-        <w:spacing w:before="0" w:after="23" w:line="240" w:lineRule="auto"/>
-        <w:ind w:left="259" w:hanging="173"/>
+        <w:spacing w:before="0" w:after="68" w:line="271" w:lineRule="auto"/>
+        <w:ind w:left="317" w:hanging="202"/>
       </w:pPr>
       <w:r>
         <w:rPr>
@@ -691,7 +692,7 @@
           <w:b w:val="0"/>
           <w:i w:val="0"/>
           <w:color w:val="111827"/>
-          <w:sz w:val="15"/>
+          <w:sz w:val="19"/>
         </w:rPr>
         <w:t>Built an AI visibility and SEO/AEO/GEO auditing platform for large-site diagnostic workflows.</w:t>
       </w:r>
@@ -699,8 +700,8 @@
     <w:p>
       <w:pPr>
         <w:pStyle w:val="ListBullet"/>
-        <w:spacing w:before="0" w:after="23" w:line="240" w:lineRule="auto"/>
-        <w:ind w:left="259" w:hanging="173"/>
+        <w:spacing w:before="0" w:after="68" w:line="271" w:lineRule="auto"/>
+        <w:ind w:left="317" w:hanging="202"/>
       </w:pPr>
       <w:r>
         <w:rPr>
@@ -708,7 +709,7 @@
           <w:b w:val="0"/>
           <w:i w:val="0"/>
           <w:color w:val="111827"/>
-          <w:sz w:val="15"/>
+          <w:sz w:val="19"/>
         </w:rPr>
         <w:t>Designed parallel Playwright headless crawls that process 10,000+ pages per audit and compare server HTML with rendered DOM.</w:t>
       </w:r>
@@ -716,8 +717,8 @@
     <w:p>
       <w:pPr>
         <w:pStyle w:val="ListBullet"/>
-        <w:spacing w:before="0" w:after="23" w:line="240" w:lineRule="auto"/>
-        <w:ind w:left="259" w:hanging="173"/>
+        <w:spacing w:before="0" w:after="68" w:line="271" w:lineRule="auto"/>
+        <w:ind w:left="317" w:hanging="202"/>
       </w:pPr>
       <w:r>
         <w:rPr>
@@ -725,7 +726,7 @@
           <w:b w:val="0"/>
           <w:i w:val="0"/>
           <w:color w:val="111827"/>
-          <w:sz w:val="15"/>
+          <w:sz w:val="19"/>
         </w:rPr>
         <w:t>Implemented a FastAPI + Celery backend with Redis, PostgreSQL, and 18 parallel audit analyzers for severity-prioritized fix queues.</w:t>
       </w:r>
@@ -733,8 +734,8 @@
     <w:p>
       <w:pPr>
         <w:pStyle w:val="ListBullet"/>
-        <w:spacing w:before="0" w:after="23" w:line="240" w:lineRule="auto"/>
-        <w:ind w:left="259" w:hanging="173"/>
+        <w:spacing w:before="0" w:after="68" w:line="271" w:lineRule="auto"/>
+        <w:ind w:left="317" w:hanging="202"/>
       </w:pPr>
       <w:r>
         <w:rPr>
@@ -742,14 +743,14 @@
           <w:b w:val="0"/>
           <w:i w:val="0"/>
           <w:color w:val="111827"/>
-          <w:sz w:val="15"/>
+          <w:sz w:val="19"/>
         </w:rPr>
         <w:t>Audits robots.txt, sitemaps, structured data schemas, and llms.txt configurations, reducing technical audit cycle time by 85%.</w:t>
       </w:r>
     </w:p>
     <w:p>
       <w:pPr>
-        <w:spacing w:before="48" w:after="16" w:line="240" w:lineRule="auto"/>
+        <w:spacing w:before="60" w:after="36" w:line="259" w:lineRule="auto"/>
       </w:pPr>
       <w:r>
         <w:rPr>
@@ -757,7 +758,7 @@
           <w:b/>
           <w:i w:val="0"/>
           <w:color w:val="0B2545"/>
-          <w:sz w:val="16"/>
+          <w:sz w:val="20"/>
         </w:rPr>
         <w:t>Technical Blog (Python &amp; AI Learning Hub)</w:t>
       </w:r>
@@ -767,7 +768,7 @@
           <w:b/>
           <w:i w:val="0"/>
           <w:color w:val="111827"/>
-          <w:sz w:val="16"/>
+          <w:sz w:val="20"/>
         </w:rPr>
         <w:t xml:space="preserve"> | Full-stack AI Product</w:t>
       </w:r>
@@ -777,7 +778,7 @@
           <w:b w:val="0"/>
           <w:i w:val="0"/>
           <w:color w:val="4B5563"/>
-          <w:sz w:val="15"/>
+          <w:sz w:val="20"/>
         </w:rPr>
         <w:t xml:space="preserve"> | January 2026 - Present</w:t>
       </w:r>
@@ -787,7 +788,7 @@
           <w:b w:val="0"/>
           <w:i w:val="0"/>
           <w:color w:val="2563EB"/>
-          <w:sz w:val="15"/>
+          <w:sz w:val="20"/>
         </w:rPr>
         <w:t xml:space="preserve"> | madhudadi.in/blog</w:t>
       </w:r>
@@ -795,8 +796,8 @@
     <w:p>
       <w:pPr>
         <w:pStyle w:val="ListBullet"/>
-        <w:spacing w:before="0" w:after="23" w:line="240" w:lineRule="auto"/>
-        <w:ind w:left="259" w:hanging="173"/>
+        <w:spacing w:before="0" w:after="68" w:line="271" w:lineRule="auto"/>
+        <w:ind w:left="317" w:hanging="202"/>
       </w:pPr>
       <w:r>
         <w:rPr>
@@ -804,7 +805,7 @@
           <w:b w:val="0"/>
           <w:i w:val="0"/>
           <w:color w:val="111827"/>
-          <w:sz w:val="15"/>
+          <w:sz w:val="19"/>
         </w:rPr>
         <w:t>Engineered a production-ready technical blog using FastAPI and Next.js, processing a knowledge base of 50+ articles with a RAG system.</w:t>
       </w:r>
@@ -812,8 +813,8 @@
     <w:p>
       <w:pPr>
         <w:pStyle w:val="ListBullet"/>
-        <w:spacing w:before="0" w:after="23" w:line="240" w:lineRule="auto"/>
-        <w:ind w:left="259" w:hanging="173"/>
+        <w:spacing w:before="0" w:after="68" w:line="271" w:lineRule="auto"/>
+        <w:ind w:left="317" w:hanging="202"/>
       </w:pPr>
       <w:r>
         <w:rPr>
@@ -821,7 +822,7 @@
           <w:b w:val="0"/>
           <w:i w:val="0"/>
           <w:color w:val="111827"/>
-          <w:sz w:val="15"/>
+          <w:sz w:val="19"/>
         </w:rPr>
         <w:t>Integrated an AI Q&amp;A assistant powered by LangChain and RAG, achieving sub-second response times for complex AI queries.</w:t>
       </w:r>
@@ -829,8 +830,8 @@
     <w:p>
       <w:pPr>
         <w:pStyle w:val="ListBullet"/>
-        <w:spacing w:before="0" w:after="23" w:line="240" w:lineRule="auto"/>
-        <w:ind w:left="259" w:hanging="173"/>
+        <w:spacing w:before="0" w:after="68" w:line="271" w:lineRule="auto"/>
+        <w:ind w:left="317" w:hanging="202"/>
       </w:pPr>
       <w:r>
         <w:rPr>
@@ -838,14 +839,14 @@
           <w:b w:val="0"/>
           <w:i w:val="0"/>
           <w:color w:val="111827"/>
-          <w:sz w:val="15"/>
+          <w:sz w:val="19"/>
         </w:rPr>
         <w:t>Optimized the Next.js frontend to 95+ Lighthouse scores for speed and accessibility, contributing to a 20% increase in user engagement.</w:t>
       </w:r>
     </w:p>
     <w:p>
       <w:pPr>
-        <w:spacing w:before="48" w:after="16" w:line="240" w:lineRule="auto"/>
+        <w:spacing w:before="60" w:after="36" w:line="259" w:lineRule="auto"/>
       </w:pPr>
       <w:r>
         <w:rPr>
@@ -853,7 +854,7 @@
           <w:b/>
           <w:i w:val="0"/>
           <w:color w:val="0B2545"/>
-          <w:sz w:val="16"/>
+          <w:sz w:val="20"/>
         </w:rPr>
         <w:t>Udemy Enroller</w:t>
       </w:r>
@@ -863,7 +864,7 @@
           <w:b/>
           <w:i w:val="0"/>
           <w:color w:val="111827"/>
-          <w:sz w:val="16"/>
+          <w:sz w:val="20"/>
         </w:rPr>
         <w:t xml:space="preserve"> | Automation Platform</w:t>
       </w:r>
@@ -873,7 +874,7 @@
           <w:b w:val="0"/>
           <w:i w:val="0"/>
           <w:color w:val="4B5563"/>
-          <w:sz w:val="15"/>
+          <w:sz w:val="20"/>
         </w:rPr>
         <w:t xml:space="preserve"> | January 2026 - Present</w:t>
       </w:r>
@@ -883,7 +884,7 @@
           <w:b w:val="0"/>
           <w:i w:val="0"/>
           <w:color w:val="2563EB"/>
-          <w:sz w:val="15"/>
+          <w:sz w:val="20"/>
         </w:rPr>
         <w:t xml:space="preserve"> | udemyenroller.madhudadi.in</w:t>
       </w:r>
@@ -891,8 +892,8 @@
     <w:p>
       <w:pPr>
         <w:pStyle w:val="ListBullet"/>
-        <w:spacing w:before="0" w:after="23" w:line="240" w:lineRule="auto"/>
-        <w:ind w:left="259" w:hanging="173"/>
+        <w:spacing w:before="0" w:after="68" w:line="271" w:lineRule="auto"/>
+        <w:ind w:left="317" w:hanging="202"/>
       </w:pPr>
       <w:r>
         <w:rPr>
@@ -900,7 +901,7 @@
           <w:b w:val="0"/>
           <w:i w:val="0"/>
           <w:color w:val="111827"/>
-          <w:sz w:val="15"/>
+          <w:sz w:val="19"/>
         </w:rPr>
         <w:t>Developed an automated platform that processed 20,000+ free courses within 6 months, saving users an estimated INR 10,00,000+.</w:t>
       </w:r>
@@ -908,8 +909,8 @@
     <w:p>
       <w:pPr>
         <w:pStyle w:val="ListBullet"/>
-        <w:spacing w:before="0" w:after="23" w:line="240" w:lineRule="auto"/>
-        <w:ind w:left="259" w:hanging="173"/>
+        <w:spacing w:before="0" w:after="68" w:line="271" w:lineRule="auto"/>
+        <w:ind w:left="317" w:hanging="202"/>
       </w:pPr>
       <w:r>
         <w:rPr>
@@ -917,7 +918,7 @@
           <w:b w:val="0"/>
           <w:i w:val="0"/>
           <w:color w:val="111827"/>
-          <w:sz w:val="15"/>
+          <w:sz w:val="19"/>
         </w:rPr>
         <w:t>Engineered a backend with asynchronous task queues and Redis to handle throughput of 100+ requests per minute.</w:t>
       </w:r>
@@ -925,8 +926,8 @@
     <w:p>
       <w:pPr>
         <w:pStyle w:val="ListBullet"/>
-        <w:spacing w:before="0" w:after="23" w:line="240" w:lineRule="auto"/>
-        <w:ind w:left="259" w:hanging="173"/>
+        <w:spacing w:before="0" w:after="68" w:line="271" w:lineRule="auto"/>
+        <w:ind w:left="317" w:hanging="202"/>
       </w:pPr>
       <w:r>
         <w:rPr>
@@ -934,14 +935,14 @@
           <w:b w:val="0"/>
           <w:i w:val="0"/>
           <w:color w:val="111827"/>
-          <w:sz w:val="15"/>
+          <w:sz w:val="19"/>
         </w:rPr>
         <w:t>Implemented custom scrapers to improve data accuracy by 15%, with CAPTCHA handling and rate limiting for resilient automation.</w:t>
       </w:r>
     </w:p>
     <w:p>
       <w:pPr>
-        <w:spacing w:before="100" w:after="40" w:line="240" w:lineRule="auto"/>
+        <w:spacing w:before="160" w:after="70" w:line="259" w:lineRule="auto"/>
         <w:pBdr>
           <w:bottom w:val="single" w:sz="5" w:space="1" w:color="9FB6CF"/>
         </w:pBdr>
@@ -952,7 +953,7 @@
           <w:b/>
           <w:i w:val="0"/>
           <w:color w:val="1F4D78"/>
-          <w:sz w:val="17"/>
+          <w:sz w:val="21"/>
         </w:rPr>
         <w:t>SKILLS</w:t>
       </w:r>
@@ -983,7 +984,7 @@
           </w:tcPr>
           <w:p>
             <w:pPr>
-              <w:spacing w:after="0"/>
+              <w:spacing w:after="28" w:before="0" w:line="259" w:lineRule="auto"/>
             </w:pPr>
             <w:r>
               <w:rPr>
@@ -991,7 +992,7 @@
                 <w:b/>
                 <w:i w:val="0"/>
                 <w:color w:val="0B2545"/>
-                <w:sz w:val="14"/>
+                <w:sz w:val="19"/>
               </w:rPr>
               <w:t>AI / LLM</w:t>
             </w:r>
@@ -1010,7 +1011,7 @@
           </w:tcPr>
           <w:p>
             <w:pPr>
-              <w:spacing w:after="0"/>
+              <w:spacing w:after="28" w:line="259" w:lineRule="auto" w:before="0"/>
             </w:pPr>
             <w:r>
               <w:rPr>
@@ -1018,7 +1019,7 @@
                 <w:b w:val="0"/>
                 <w:i w:val="0"/>
                 <w:color w:val="111827"/>
-                <w:sz w:val="14"/>
+                <w:sz w:val="18"/>
               </w:rPr>
               <w:t>Agentic AI, RAG, LangChain, MCPs, Machine Learning, Deep Learning, NLP, MLOps, DevOps</w:t>
             </w:r>
@@ -1040,7 +1041,7 @@
           </w:tcPr>
           <w:p>
             <w:pPr>
-              <w:spacing w:after="0"/>
+              <w:spacing w:after="28" w:line="259" w:lineRule="auto" w:before="0"/>
             </w:pPr>
             <w:r>
               <w:rPr>
@@ -1048,7 +1049,7 @@
                 <w:b/>
                 <w:i w:val="0"/>
                 <w:color w:val="0B2545"/>
-                <w:sz w:val="14"/>
+                <w:sz w:val="19"/>
               </w:rPr>
               <w:t>Analytics</w:t>
             </w:r>
@@ -1067,7 +1068,7 @@
           </w:tcPr>
           <w:p>
             <w:pPr>
-              <w:spacing w:after="0"/>
+              <w:spacing w:after="28" w:line="259" w:lineRule="auto" w:before="0"/>
             </w:pPr>
             <w:r>
               <w:rPr>
@@ -1075,7 +1076,7 @@
                 <w:b w:val="0"/>
                 <w:i w:val="0"/>
                 <w:color w:val="111827"/>
-                <w:sz w:val="14"/>
+                <w:sz w:val="18"/>
               </w:rPr>
               <w:t>KPI frameworks, Marketing Mix Modeling, Hypothesis Testing, A/B Testing, Regression, Clustering, Boosting, Classification, Sentiment Analysis</w:t>
             </w:r>
@@ -1097,7 +1098,7 @@
           </w:tcPr>
           <w:p>
             <w:pPr>
-              <w:spacing w:after="0"/>
+              <w:spacing w:after="28" w:line="259" w:lineRule="auto" w:before="0"/>
             </w:pPr>
             <w:r>
               <w:rPr>
@@ -1105,7 +1106,7 @@
                 <w:b/>
                 <w:i w:val="0"/>
                 <w:color w:val="0B2545"/>
-                <w:sz w:val="14"/>
+                <w:sz w:val="19"/>
               </w:rPr>
               <w:t>Data / Cloud</w:t>
             </w:r>
@@ -1124,7 +1125,7 @@
           </w:tcPr>
           <w:p>
             <w:pPr>
-              <w:spacing w:after="0"/>
+              <w:spacing w:after="28" w:line="259" w:lineRule="auto" w:before="0"/>
             </w:pPr>
             <w:r>
               <w:rPr>
@@ -1132,7 +1133,7 @@
                 <w:b w:val="0"/>
                 <w:i w:val="0"/>
                 <w:color w:val="111827"/>
-                <w:sz w:val="14"/>
+                <w:sz w:val="18"/>
               </w:rPr>
               <w:t>Python, SQL, BigQuery, GCP (Cloud Functions, BigQuery), AWS (S3, Lambda), Big Data, Power BI, Tableau, Looker Studio</w:t>
             </w:r>
@@ -1154,7 +1155,7 @@
           </w:tcPr>
           <w:p>
             <w:pPr>
-              <w:spacing w:after="0"/>
+              <w:spacing w:after="28" w:line="259" w:lineRule="auto" w:before="0"/>
             </w:pPr>
             <w:r>
               <w:rPr>
@@ -1162,7 +1163,7 @@
                 <w:b/>
                 <w:i w:val="0"/>
                 <w:color w:val="0B2545"/>
-                <w:sz w:val="14"/>
+                <w:sz w:val="19"/>
               </w:rPr>
               <w:t>Marketing</w:t>
             </w:r>
@@ -1181,7 +1182,7 @@
           </w:tcPr>
           <w:p>
             <w:pPr>
-              <w:spacing w:after="0"/>
+              <w:spacing w:after="28" w:line="259" w:lineRule="auto" w:before="0"/>
             </w:pPr>
             <w:r>
               <w:rPr>
@@ -1189,7 +1190,7 @@
                 <w:b w:val="0"/>
                 <w:i w:val="0"/>
                 <w:color w:val="111827"/>
-                <w:sz w:val="14"/>
+                <w:sz w:val="18"/>
               </w:rPr>
               <w:t>Performance &amp; Brand Marketing, Loyalty Analytics, Web Analytics, Product Recommendation, CLM, ATL/BTL/Digital measurement</w:t>
             </w:r>
@@ -1211,7 +1212,7 @@
           </w:tcPr>
           <w:p>
             <w:pPr>
-              <w:spacing w:after="0"/>
+              <w:spacing w:after="28" w:line="259" w:lineRule="auto" w:before="0"/>
             </w:pPr>
             <w:r>
               <w:rPr>
@@ -1219,7 +1220,7 @@
                 <w:b/>
                 <w:i w:val="0"/>
                 <w:color w:val="0B2545"/>
-                <w:sz w:val="14"/>
+                <w:sz w:val="19"/>
               </w:rPr>
               <w:t>Product</w:t>
             </w:r>
@@ -1238,7 +1239,7 @@
           </w:tcPr>
           <w:p>
             <w:pPr>
-              <w:spacing w:after="0"/>
+              <w:spacing w:after="28" w:line="259" w:lineRule="auto" w:before="0"/>
             </w:pPr>
             <w:r>
               <w:rPr>
@@ -1246,7 +1247,7 @@
                 <w:b w:val="0"/>
                 <w:i w:val="0"/>
                 <w:color w:val="111827"/>
-                <w:sz w:val="14"/>
+                <w:sz w:val="18"/>
               </w:rPr>
               <w:t>FastAPI, Next.js, PostgreSQL, Redis, Celery, Playwright, Tailwind CSS, GitHub Actions</w:t>
             </w:r>
@@ -1256,7 +1257,7 @@
     </w:tbl>
     <w:p>
       <w:pPr>
-        <w:spacing w:before="100" w:after="40" w:line="240" w:lineRule="auto"/>
+        <w:spacing w:before="160" w:after="70" w:line="259" w:lineRule="auto"/>
         <w:pBdr>
           <w:bottom w:val="single" w:sz="5" w:space="1" w:color="9FB6CF"/>
         </w:pBdr>
@@ -1267,7 +1268,7 @@
           <w:b/>
           <w:i w:val="0"/>
           <w:color w:val="1F4D78"/>
-          <w:sz w:val="17"/>
+          <w:sz w:val="21"/>
         </w:rPr>
         <w:t>SELECTED AWARDS</w:t>
       </w:r>
@@ -1275,8 +1276,8 @@
     <w:p>
       <w:pPr>
         <w:pStyle w:val="ListBullet"/>
-        <w:spacing w:before="0" w:after="23" w:line="240" w:lineRule="auto"/>
-        <w:ind w:left="259" w:hanging="173"/>
+        <w:spacing w:before="0" w:after="68" w:line="271" w:lineRule="auto"/>
+        <w:ind w:left="317" w:hanging="202"/>
       </w:pPr>
       <w:r>
         <w:rPr>
@@ -1284,7 +1285,7 @@
           <w:b w:val="0"/>
           <w:i w:val="0"/>
           <w:color w:val="111827"/>
-          <w:sz w:val="15"/>
+          <w:sz w:val="19"/>
         </w:rPr>
         <w:t>Best Performer of the Quarter (Q1 2024), Novartis.</w:t>
       </w:r>
@@ -1292,8 +1293,8 @@
     <w:p>
       <w:pPr>
         <w:pStyle w:val="ListBullet"/>
-        <w:spacing w:before="0" w:after="23" w:line="240" w:lineRule="auto"/>
-        <w:ind w:left="259" w:hanging="173"/>
+        <w:spacing w:before="0" w:after="68" w:line="271" w:lineRule="auto"/>
+        <w:ind w:left="317" w:hanging="202"/>
       </w:pPr>
       <w:r>
         <w:rPr>
@@ -1301,7 +1302,7 @@
           <w:b w:val="0"/>
           <w:i w:val="0"/>
           <w:color w:val="111827"/>
-          <w:sz w:val="15"/>
+          <w:sz w:val="19"/>
         </w:rPr>
         <w:t>Best Performer of the Quarter (Q3 Trailblazer), redBus, for campaign strategy that resulted in 30% growth in new customers.</w:t>
       </w:r>
@@ -1309,8 +1310,8 @@
     <w:p>
       <w:pPr>
         <w:pStyle w:val="ListBullet"/>
-        <w:spacing w:before="0" w:after="23" w:line="240" w:lineRule="auto"/>
-        <w:ind w:left="259" w:hanging="173"/>
+        <w:spacing w:before="0" w:after="68" w:line="271" w:lineRule="auto"/>
+        <w:ind w:left="317" w:hanging="202"/>
       </w:pPr>
       <w:r>
         <w:rPr>
@@ -1318,7 +1319,7 @@
           <w:b w:val="0"/>
           <w:i w:val="0"/>
           <w:color w:val="111827"/>
-          <w:sz w:val="15"/>
+          <w:sz w:val="19"/>
         </w:rPr>
         <w:t>Best Performer of the Year (2020-2021), GroupM; selected for the WPP NextGen program.</w:t>
       </w:r>
@@ -1326,8 +1327,8 @@
     <w:p>
       <w:pPr>
         <w:pStyle w:val="ListBullet"/>
-        <w:spacing w:before="0" w:after="23" w:line="240" w:lineRule="auto"/>
-        <w:ind w:left="259" w:hanging="173"/>
+        <w:spacing w:before="0" w:after="68" w:line="271" w:lineRule="auto"/>
+        <w:ind w:left="317" w:hanging="202"/>
       </w:pPr>
       <w:r>
         <w:rPr>
@@ -1335,14 +1336,14 @@
           <w:b w:val="0"/>
           <w:i w:val="0"/>
           <w:color w:val="111827"/>
-          <w:sz w:val="15"/>
+          <w:sz w:val="19"/>
         </w:rPr>
         <w:t>Special Recognition Award for work as Manager in Aarunya fest, IIM Amritsar.</w:t>
       </w:r>
     </w:p>
     <w:p>
       <w:pPr>
-        <w:spacing w:before="100" w:after="40" w:line="240" w:lineRule="auto"/>
+        <w:spacing w:before="160" w:after="70" w:line="259" w:lineRule="auto"/>
         <w:pBdr>
           <w:bottom w:val="single" w:sz="5" w:space="1" w:color="9FB6CF"/>
         </w:pBdr>
@@ -1353,7 +1354,7 @@
           <w:b/>
           <w:i w:val="0"/>
           <w:color w:val="1F4D78"/>
-          <w:sz w:val="17"/>
+          <w:sz w:val="21"/>
         </w:rPr>
         <w:t>EDUCATION</w:t>
       </w:r>
@@ -1387,13 +1388,16 @@
             </w:tcBorders>
           </w:tcPr>
           <w:p>
+            <w:pPr>
+              <w:spacing w:line="259" w:lineRule="auto" w:before="0" w:after="28"/>
+            </w:pPr>
             <w:r>
               <w:rPr>
                 <w:rFonts w:ascii="Arial" w:hAnsi="Arial" w:eastAsia="Arial"/>
                 <w:b/>
                 <w:i w:val="0"/>
                 <w:color w:val="0B2545"/>
-                <w:sz w:val="14"/>
+                <w:sz w:val="19"/>
               </w:rPr>
               <w:t>Degree</w:t>
             </w:r>
@@ -1411,13 +1415,16 @@
             </w:tcBorders>
           </w:tcPr>
           <w:p>
+            <w:pPr>
+              <w:spacing w:line="259" w:lineRule="auto" w:before="0" w:after="28"/>
+            </w:pPr>
             <w:r>
               <w:rPr>
                 <w:rFonts w:ascii="Arial" w:hAnsi="Arial" w:eastAsia="Arial"/>
                 <w:b/>
                 <w:i w:val="0"/>
                 <w:color w:val="0B2545"/>
-                <w:sz w:val="14"/>
+                <w:sz w:val="19"/>
               </w:rPr>
               <w:t>Duration</w:t>
             </w:r>
@@ -1435,13 +1442,16 @@
             </w:tcBorders>
           </w:tcPr>
           <w:p>
+            <w:pPr>
+              <w:spacing w:line="259" w:lineRule="auto" w:before="0" w:after="28"/>
+            </w:pPr>
             <w:r>
               <w:rPr>
                 <w:rFonts w:ascii="Arial" w:hAnsi="Arial" w:eastAsia="Arial"/>
                 <w:b/>
                 <w:i w:val="0"/>
                 <w:color w:val="0B2545"/>
-                <w:sz w:val="14"/>
+                <w:sz w:val="19"/>
               </w:rPr>
               <w:t>Institute / Specialization</w:t>
             </w:r>
@@ -1459,13 +1469,16 @@
             </w:tcBorders>
           </w:tcPr>
           <w:p>
+            <w:pPr>
+              <w:spacing w:line="259" w:lineRule="auto" w:before="0" w:after="28"/>
+            </w:pPr>
             <w:r>
               <w:rPr>
                 <w:rFonts w:ascii="Arial" w:hAnsi="Arial" w:eastAsia="Arial"/>
                 <w:b/>
                 <w:i w:val="0"/>
                 <w:color w:val="0B2545"/>
-                <w:sz w:val="14"/>
+                <w:sz w:val="19"/>
               </w:rPr>
               <w:t>Grade</w:t>
             </w:r>
@@ -1484,13 +1497,16 @@
             </w:tcBorders>
           </w:tcPr>
           <w:p>
+            <w:pPr>
+              <w:spacing w:before="0" w:after="28" w:line="259" w:lineRule="auto"/>
+            </w:pPr>
             <w:r>
               <w:rPr>
                 <w:rFonts w:ascii="Arial" w:hAnsi="Arial" w:eastAsia="Arial"/>
                 <w:b w:val="0"/>
                 <w:i w:val="0"/>
                 <w:color w:val="111827"/>
-                <w:sz w:val="14"/>
+                <w:sz w:val="18"/>
               </w:rPr>
               <w:t>MBA</w:t>
             </w:r>
@@ -1507,13 +1523,16 @@
             </w:tcBorders>
           </w:tcPr>
           <w:p>
+            <w:pPr>
+              <w:spacing w:line="259" w:lineRule="auto" w:before="0" w:after="28"/>
+            </w:pPr>
             <w:r>
               <w:rPr>
                 <w:rFonts w:ascii="Arial" w:hAnsi="Arial" w:eastAsia="Arial"/>
                 <w:b w:val="0"/>
                 <w:i w:val="0"/>
                 <w:color w:val="111827"/>
-                <w:sz w:val="14"/>
+                <w:sz w:val="18"/>
               </w:rPr>
               <w:t>2018-2020</w:t>
             </w:r>
@@ -1530,13 +1549,16 @@
             </w:tcBorders>
           </w:tcPr>
           <w:p>
+            <w:pPr>
+              <w:spacing w:line="259" w:lineRule="auto" w:before="0" w:after="28"/>
+            </w:pPr>
             <w:r>
               <w:rPr>
                 <w:rFonts w:ascii="Arial" w:hAnsi="Arial" w:eastAsia="Arial"/>
                 <w:b w:val="0"/>
                 <w:i w:val="0"/>
                 <w:color w:val="111827"/>
-                <w:sz w:val="14"/>
+                <w:sz w:val="18"/>
               </w:rPr>
               <w:t>Indian Institute of Management, Amritsar | Marketing / Analytics</w:t>
             </w:r>
@@ -1553,13 +1575,16 @@
             </w:tcBorders>
           </w:tcPr>
           <w:p>
+            <w:pPr>
+              <w:spacing w:line="259" w:lineRule="auto" w:before="0" w:after="28"/>
+            </w:pPr>
             <w:r>
               <w:rPr>
                 <w:rFonts w:ascii="Arial" w:hAnsi="Arial" w:eastAsia="Arial"/>
                 <w:b w:val="0"/>
                 <w:i w:val="0"/>
                 <w:color w:val="111827"/>
-                <w:sz w:val="14"/>
+                <w:sz w:val="18"/>
               </w:rPr>
               <w:t>3.371/4.33</w:t>
             </w:r>
@@ -1578,13 +1603,16 @@
             </w:tcBorders>
           </w:tcPr>
           <w:p>
+            <w:pPr>
+              <w:spacing w:line="259" w:lineRule="auto" w:before="0" w:after="28"/>
+            </w:pPr>
             <w:r>
               <w:rPr>
                 <w:rFonts w:ascii="Arial" w:hAnsi="Arial" w:eastAsia="Arial"/>
                 <w:b w:val="0"/>
                 <w:i w:val="0"/>
                 <w:color w:val="111827"/>
-                <w:sz w:val="14"/>
+                <w:sz w:val="18"/>
               </w:rPr>
               <w:t>B.Tech.</w:t>
             </w:r>
@@ -1601,13 +1629,16 @@
             </w:tcBorders>
           </w:tcPr>
           <w:p>
+            <w:pPr>
+              <w:spacing w:line="259" w:lineRule="auto" w:before="0" w:after="28"/>
+            </w:pPr>
             <w:r>
               <w:rPr>
                 <w:rFonts w:ascii="Arial" w:hAnsi="Arial" w:eastAsia="Arial"/>
                 <w:b w:val="0"/>
                 <w:i w:val="0"/>
                 <w:color w:val="111827"/>
-                <w:sz w:val="14"/>
+                <w:sz w:val="18"/>
               </w:rPr>
               <w:t>2012-2016</w:t>
             </w:r>
@@ -1624,13 +1655,16 @@
             </w:tcBorders>
           </w:tcPr>
           <w:p>
+            <w:pPr>
+              <w:spacing w:line="259" w:lineRule="auto" w:before="0" w:after="28"/>
+            </w:pPr>
             <w:r>
               <w:rPr>
                 <w:rFonts w:ascii="Arial" w:hAnsi="Arial" w:eastAsia="Arial"/>
                 <w:b w:val="0"/>
                 <w:i w:val="0"/>
                 <w:color w:val="111827"/>
-                <w:sz w:val="14"/>
+                <w:sz w:val="18"/>
               </w:rPr>
               <w:t>MVGR College of Engineering | Electrical and Electronics Engineering</w:t>
             </w:r>
@@ -1647,13 +1681,16 @@
             </w:tcBorders>
           </w:tcPr>
           <w:p>
+            <w:pPr>
+              <w:spacing w:line="259" w:lineRule="auto" w:before="0" w:after="28"/>
+            </w:pPr>
             <w:r>
               <w:rPr>
                 <w:rFonts w:ascii="Arial" w:hAnsi="Arial" w:eastAsia="Arial"/>
                 <w:b w:val="0"/>
                 <w:i w:val="0"/>
                 <w:color w:val="111827"/>
-                <w:sz w:val="14"/>
+                <w:sz w:val="18"/>
               </w:rPr>
               <w:t>79.75%</w:t>
             </w:r>
@@ -1661,9 +1698,106 @@
         </w:tc>
       </w:tr>
     </w:tbl>
+    <w:p>
+      <w:pPr>
+        <w:spacing w:before="160" w:after="70" w:line="259" w:lineRule="auto"/>
+        <w:pBdr>
+          <w:bottom w:val="single" w:sz="5" w:space="1" w:color="9FB6CF"/>
+        </w:pBdr>
+      </w:pPr>
+      <w:r>
+        <w:rPr>
+          <w:rFonts w:ascii="Arial" w:hAnsi="Arial" w:eastAsia="Arial"/>
+          <w:b/>
+          <w:color w:val="1F4D78"/>
+          <w:sz w:val="21"/>
+        </w:rPr>
+        <w:t>SELECTED CERTIFICATIONS</w:t>
+      </w:r>
+    </w:p>
+    <w:p>
+      <w:pPr>
+        <w:pStyle w:val="ListBullet"/>
+        <w:spacing w:before="0" w:after="68" w:line="271" w:lineRule="auto"/>
+        <w:ind w:left="317" w:hanging="202"/>
+      </w:pPr>
+      <w:r>
+        <w:rPr>
+          <w:rFonts w:ascii="Arial" w:hAnsi="Arial" w:eastAsia="Arial"/>
+          <w:b w:val="0"/>
+          <w:color w:val="111827"/>
+          <w:sz w:val="19"/>
+        </w:rPr>
+        <w:t>Ultimate RAG Bootcamp, LangChain, LangGraph, LangSmith - Udemy.</w:t>
+      </w:r>
+    </w:p>
+    <w:p>
+      <w:pPr>
+        <w:pStyle w:val="ListBullet"/>
+        <w:spacing w:before="0" w:after="68" w:line="271" w:lineRule="auto"/>
+        <w:ind w:left="317" w:hanging="202"/>
+      </w:pPr>
+      <w:r>
+        <w:rPr>
+          <w:rFonts w:ascii="Arial" w:hAnsi="Arial" w:eastAsia="Arial"/>
+          <w:b w:val="0"/>
+          <w:color w:val="111827"/>
+          <w:sz w:val="19"/>
+        </w:rPr>
+        <w:t>Complete Data Science, ML, DL, NLP Bootcamp - Udemy.</w:t>
+      </w:r>
+    </w:p>
+    <w:p>
+      <w:pPr>
+        <w:pStyle w:val="ListBullet"/>
+        <w:spacing w:before="0" w:after="68" w:line="271" w:lineRule="auto"/>
+        <w:ind w:left="317" w:hanging="202"/>
+      </w:pPr>
+      <w:r>
+        <w:rPr>
+          <w:rFonts w:ascii="Arial" w:hAnsi="Arial" w:eastAsia="Arial"/>
+          <w:b w:val="0"/>
+          <w:color w:val="111827"/>
+          <w:sz w:val="19"/>
+        </w:rPr>
+        <w:t>Azure AI Fundamentals - Microsoft.</w:t>
+      </w:r>
+    </w:p>
+    <w:p>
+      <w:pPr>
+        <w:pStyle w:val="ListBullet"/>
+        <w:spacing w:before="0" w:after="68" w:line="271" w:lineRule="auto"/>
+        <w:ind w:left="317" w:hanging="202"/>
+      </w:pPr>
+      <w:r>
+        <w:rPr>
+          <w:rFonts w:ascii="Arial" w:hAnsi="Arial" w:eastAsia="Arial"/>
+          <w:b w:val="0"/>
+          <w:color w:val="111827"/>
+          <w:sz w:val="19"/>
+        </w:rPr>
+        <w:t>MongoDB Python Developer Path - MongoDB.</w:t>
+      </w:r>
+    </w:p>
+    <w:p>
+      <w:pPr>
+        <w:pStyle w:val="ListBullet"/>
+        <w:spacing w:before="0" w:after="68" w:line="271" w:lineRule="auto"/>
+        <w:ind w:left="317" w:hanging="202"/>
+      </w:pPr>
+      <w:r>
+        <w:rPr>
+          <w:rFonts w:ascii="Arial" w:hAnsi="Arial" w:eastAsia="Arial"/>
+          <w:b w:val="0"/>
+          <w:color w:val="111827"/>
+          <w:sz w:val="19"/>
+        </w:rPr>
+        <w:t>GitHub Actions Professional - GitHub.</w:t>
+      </w:r>
+    </w:p>
     <w:sectPr>
       <w:pgSz w:w="12240" w:h="15840"/>
-      <w:pgMar w:top="547" w:right="691" w:bottom="547" w:left="691" w:header="360" w:footer="360" w:gutter="0"/>
+      <w:pgMar w:top="605" w:right="691" w:bottom="605" w:left="691" w:header="360" w:footer="360" w:gutter="0"/>
       <w:cols w:space="720"/>
       <w:docGrid w:linePitch="360"/>
     </w:sectPr>

</xml_diff>

<commit_message>
fix: format llms.txt with explicit line breaks using dynamic array joining to bypass next.js compilation minifier whitespace collapsing
</commit_message>
<xml_diff>
--- a/Madhu Dadi_Resume_Optimized.docx
+++ b/Madhu Dadi_Resume_Optimized.docx
@@ -1700,7 +1700,7 @@
     </w:tbl>
     <w:p>
       <w:pPr>
-        <w:spacing w:before="160" w:after="70" w:line="259" w:lineRule="auto"/>
+        <w:spacing w:before="180" w:after="80" w:line="259" w:lineRule="auto"/>
         <w:pBdr>
           <w:bottom w:val="single" w:sz="5" w:space="1" w:color="9FB6CF"/>
         </w:pBdr>
@@ -1712,13 +1712,13 @@
           <w:color w:val="1F4D78"/>
           <w:sz w:val="21"/>
         </w:rPr>
-        <w:t>SELECTED CERTIFICATIONS</w:t>
+        <w:t>LEADERSHIP &amp; IMPACT HIGHLIGHTS</w:t>
       </w:r>
     </w:p>
     <w:p>
       <w:pPr>
         <w:pStyle w:val="ListBullet"/>
-        <w:spacing w:before="0" w:after="68" w:line="271" w:lineRule="auto"/>
+        <w:spacing w:before="0" w:after="64" w:line="269" w:lineRule="auto"/>
         <w:ind w:left="317" w:hanging="202"/>
       </w:pPr>
       <w:r>
@@ -1728,13 +1728,13 @@
           <w:color w:val="111827"/>
           <w:sz w:val="19"/>
         </w:rPr>
-        <w:t>Ultimate RAG Bootcamp, LangChain, LangGraph, LangSmith - Udemy.</w:t>
+        <w:t>Led cross-functional analytics programs across marketing, IT, patient support, and analytics teams to integrate digital analytics into business processes.</w:t>
       </w:r>
     </w:p>
     <w:p>
       <w:pPr>
         <w:pStyle w:val="ListBullet"/>
-        <w:spacing w:before="0" w:after="68" w:line="271" w:lineRule="auto"/>
+        <w:spacing w:before="0" w:after="64" w:line="269" w:lineRule="auto"/>
         <w:ind w:left="317" w:hanging="202"/>
       </w:pPr>
       <w:r>
@@ -1744,13 +1744,13 @@
           <w:color w:val="111827"/>
           <w:sz w:val="19"/>
         </w:rPr>
-        <w:t>Complete Data Science, ML, DL, NLP Bootcamp - Udemy.</w:t>
+        <w:t>Directed end-to-end analytics initiatives from data collection and analysis to actionable insights, reporting, and executive decision support.</w:t>
       </w:r>
     </w:p>
     <w:p>
       <w:pPr>
         <w:pStyle w:val="ListBullet"/>
-        <w:spacing w:before="0" w:after="68" w:line="271" w:lineRule="auto"/>
+        <w:spacing w:before="0" w:after="64" w:line="269" w:lineRule="auto"/>
         <w:ind w:left="317" w:hanging="202"/>
       </w:pPr>
       <w:r>
@@ -1760,13 +1760,13 @@
           <w:color w:val="111827"/>
           <w:sz w:val="19"/>
         </w:rPr>
-        <w:t>Azure AI Fundamentals - Microsoft.</w:t>
+        <w:t>Presented analytical findings and strategic recommendations to senior leadership across Marketing and Patient Support divisions.</w:t>
       </w:r>
     </w:p>
     <w:p>
       <w:pPr>
         <w:pStyle w:val="ListBullet"/>
-        <w:spacing w:before="0" w:after="68" w:line="271" w:lineRule="auto"/>
+        <w:spacing w:before="0" w:after="64" w:line="269" w:lineRule="auto"/>
         <w:ind w:left="317" w:hanging="202"/>
       </w:pPr>
       <w:r>
@@ -1776,13 +1776,13 @@
           <w:color w:val="111827"/>
           <w:sz w:val="19"/>
         </w:rPr>
-        <w:t>MongoDB Python Developer Path - MongoDB.</w:t>
+        <w:t>Trained and mentored team members in AI and analytics best practices, supporting a stronger data-centric culture.</w:t>
       </w:r>
     </w:p>
     <w:p>
       <w:pPr>
         <w:pStyle w:val="ListBullet"/>
-        <w:spacing w:before="0" w:after="68" w:line="271" w:lineRule="auto"/>
+        <w:spacing w:before="0" w:after="64" w:line="269" w:lineRule="auto"/>
         <w:ind w:left="317" w:hanging="202"/>
       </w:pPr>
       <w:r>
@@ -1792,7 +1792,7 @@
           <w:color w:val="111827"/>
           <w:sz w:val="19"/>
         </w:rPr>
-        <w:t>GitHub Actions Professional - GitHub.</w:t>
+        <w:t>Led marketing analytics measurement for ATL, BTL, digital, and CLM campaigns across redBus markets and channels.</w:t>
       </w:r>
     </w:p>
     <w:sectPr>

</xml_diff>

<commit_message>
docs: sync optimized resume documents
</commit_message>
<xml_diff>
--- a/Madhu Dadi_Resume_Optimized.docx
+++ b/Madhu Dadi_Resume_Optimized.docx
@@ -286,6 +286,20 @@
     </w:p>
     <w:p>
       <w:pPr>
+        <w:pStyle w:val="ListBullet"/>
+        <w:spacing w:after="100" w:line="288" w:lineRule="auto"/>
+        <w:ind w:left="317" w:hanging="202"/>
+      </w:pPr>
+      <w:r>
+        <w:rPr>
+          <w:rFonts w:ascii="Arial" w:hAnsi="Arial" w:eastAsia="Arial"/>
+          <w:sz w:val="20"/>
+        </w:rPr>
+        <w:t>Collaborated with marketing, IT, patient support, and analytics teams to integrate digital analytics into business processes and achieve project goals.</w:t>
+      </w:r>
+    </w:p>
+    <w:p>
+      <w:pPr>
         <w:spacing w:before="80" w:after="44" w:line="259" w:lineRule="auto"/>
       </w:pPr>
       <w:r>
@@ -395,6 +409,20 @@
           <w:sz w:val="20"/>
         </w:rPr>
         <w:t>Led marketing analytics measurement for ATL, BTL, and digital campaigns, including impact reporting across redBus markets.</w:t>
+      </w:r>
+    </w:p>
+    <w:p>
+      <w:pPr>
+        <w:pStyle w:val="ListBullet"/>
+        <w:spacing w:after="100" w:line="288" w:lineRule="auto"/>
+        <w:ind w:left="317" w:hanging="202"/>
+      </w:pPr>
+      <w:r>
+        <w:rPr>
+          <w:rFonts w:ascii="Arial" w:hAnsi="Arial" w:eastAsia="Arial"/>
+          <w:sz w:val="20"/>
+        </w:rPr>
+        <w:t>Delivered brand campaign impact analysis across India, Malaysia, Indonesia, and Singapore, helping increase brand awareness by 15%.</w:t>
       </w:r>
     </w:p>
     <w:p>

</xml_diff>